<commit_message>
Add resignation reason options, sample-filled previews, and 4 form page templates
- 사직서: add 권고사직 / 계약기간 만료 reason options
- Generate 작성 예시 images (가상 data: 홍길동/(주)예시회사) for all 5 forms
- Add HTML page templates: 이직확인서, 수급자격 인정신청서, 표준근로계약서(2025년 배포판), 산재 요양급여신청서
- Original law.go.kr files are not bundled; see forms/pages/files/README.md

Co-Authored-By: Claude Sonnet 5.5 <noreply@anthropic.com>
Claude-Session: https://claude.ai/code/session_017xGFsai7jkNkcqbuWXJhXP
</commit_message>
<xml_diff>
--- a/forms/1_사직서.docx
+++ b/forms/1_사직서.docx
@@ -118,6 +118,7 @@
             <w:r>
               <w:rPr>
                 <w:rFonts w:ascii="맑은 고딕" w:cs="맑은 고딕" w:eastAsia="맑은 고딕" w:hAnsi="맑은 고딕"/>
+                <w:color w:val="1F4E9C"/>
                 <w:sz w:val="20"/>
                 <w:szCs w:val="20"/>
               </w:rPr>
@@ -185,6 +186,7 @@
             <w:r>
               <w:rPr>
                 <w:rFonts w:ascii="맑은 고딕" w:cs="맑은 고딕" w:eastAsia="맑은 고딕" w:hAnsi="맑은 고딕"/>
+                <w:color w:val="1F4E9C"/>
                 <w:sz w:val="20"/>
                 <w:szCs w:val="20"/>
               </w:rPr>
@@ -258,6 +260,7 @@
             <w:r>
               <w:rPr>
                 <w:rFonts w:ascii="맑은 고딕" w:cs="맑은 고딕" w:eastAsia="맑은 고딕" w:hAnsi="맑은 고딕"/>
+                <w:color w:val="1F4E9C"/>
                 <w:sz w:val="20"/>
                 <w:szCs w:val="20"/>
               </w:rPr>
@@ -325,6 +328,7 @@
             <w:r>
               <w:rPr>
                 <w:rFonts w:ascii="맑은 고딕" w:cs="맑은 고딕" w:eastAsia="맑은 고딕" w:hAnsi="맑은 고딕"/>
+                <w:color w:val="1F4E9C"/>
                 <w:sz w:val="20"/>
                 <w:szCs w:val="20"/>
               </w:rPr>
@@ -398,6 +402,7 @@
             <w:r>
               <w:rPr>
                 <w:rFonts w:ascii="맑은 고딕" w:cs="맑은 고딕" w:eastAsia="맑은 고딕" w:hAnsi="맑은 고딕"/>
+                <w:color w:val="1F4E9C"/>
                 <w:sz w:val="20"/>
                 <w:szCs w:val="20"/>
               </w:rPr>
@@ -465,6 +470,7 @@
             <w:r>
               <w:rPr>
                 <w:rFonts w:ascii="맑은 고딕" w:cs="맑은 고딕" w:eastAsia="맑은 고딕" w:hAnsi="맑은 고딕"/>
+                <w:color w:val="1F4E9C"/>
                 <w:sz w:val="20"/>
                 <w:szCs w:val="20"/>
               </w:rPr>
@@ -539,6 +545,7 @@
             <w:r>
               <w:rPr>
                 <w:rFonts w:ascii="맑은 고딕" w:cs="맑은 고딕" w:eastAsia="맑은 고딕" w:hAnsi="맑은 고딕"/>
+                <w:color w:val="1F4E9C"/>
                 <w:sz w:val="20"/>
                 <w:szCs w:val="20"/>
               </w:rPr>
@@ -612,6 +619,7 @@
             <w:r>
               <w:rPr>
                 <w:rFonts w:ascii="맑은 고딕" w:cs="맑은 고딕" w:eastAsia="맑은 고딕" w:hAnsi="맑은 고딕"/>
+                <w:color w:val="1F4E9C"/>
                 <w:sz w:val="20"/>
                 <w:szCs w:val="20"/>
               </w:rPr>
@@ -679,6 +687,7 @@
             <w:r>
               <w:rPr>
                 <w:rFonts w:ascii="맑은 고딕" w:cs="맑은 고딕" w:eastAsia="맑은 고딕" w:hAnsi="맑은 고딕"/>
+                <w:color w:val="1F4E9C"/>
                 <w:sz w:val="20"/>
                 <w:szCs w:val="20"/>
               </w:rPr>
@@ -726,7 +735,7 @@
       <w:tr>
         <w:trPr>
           <w:cantSplit/>
-          <w:trHeight w:val="640" w:hRule="atLeast"/>
+          <w:trHeight w:val="760" w:hRule="atLeast"/>
         </w:trPr>
         <w:tc>
           <w:tcPr>
@@ -793,6 +802,20 @@
                 <w:szCs w:val="20"/>
               </w:rPr>
               <w:t xml:space="preserve">☐ 개인 사정      ☐ 이직      ☐ 건강      ☐ 학업      ☐ 가사·육아      ☐ 기타</w:t>
+            </w:r>
+          </w:p>
+          <w:p>
+            <w:pPr>
+              <w:spacing w:after="0" w:before="0" w:line="276"/>
+              <w:jc w:val="left"/>
+            </w:pPr>
+            <w:r>
+              <w:rPr>
+                <w:rFonts w:ascii="맑은 고딕" w:cs="맑은 고딕" w:eastAsia="맑은 고딕" w:hAnsi="맑은 고딕"/>
+                <w:sz w:val="20"/>
+                <w:szCs w:val="20"/>
+              </w:rPr>
+              <w:t xml:space="preserve">☐ 권고사직      ☐ 계약기간 만료</w:t>
             </w:r>
           </w:p>
         </w:tc>
@@ -863,6 +886,7 @@
             <w:r>
               <w:rPr>
                 <w:rFonts w:ascii="맑은 고딕" w:cs="맑은 고딕" w:eastAsia="맑은 고딕" w:hAnsi="맑은 고딕"/>
+                <w:color w:val="1F4E9C"/>
                 <w:sz w:val="20"/>
                 <w:szCs w:val="20"/>
               </w:rPr>
@@ -973,6 +997,7 @@
             <w:r>
               <w:rPr>
                 <w:rFonts w:ascii="맑은 고딕" w:cs="맑은 고딕" w:eastAsia="맑은 고딕" w:hAnsi="맑은 고딕"/>
+                <w:color w:val="1F4E9C"/>
                 <w:sz w:val="20"/>
                 <w:szCs w:val="20"/>
               </w:rPr>
@@ -1046,6 +1071,7 @@
             <w:r>
               <w:rPr>
                 <w:rFonts w:ascii="맑은 고딕" w:cs="맑은 고딕" w:eastAsia="맑은 고딕" w:hAnsi="맑은 고딕"/>
+                <w:color w:val="1F4E9C"/>
                 <w:sz w:val="20"/>
                 <w:szCs w:val="20"/>
               </w:rPr>
@@ -1113,6 +1139,7 @@
             <w:r>
               <w:rPr>
                 <w:rFonts w:ascii="맑은 고딕" w:cs="맑은 고딕" w:eastAsia="맑은 고딕" w:hAnsi="맑은 고딕"/>
+                <w:color w:val="1F4E9C"/>
                 <w:sz w:val="20"/>
                 <w:szCs w:val="20"/>
               </w:rPr>
@@ -1190,7 +1217,7 @@
       <w:tr>
         <w:trPr>
           <w:cantSplit/>
-          <w:trHeight w:val="700" w:hRule="atLeast"/>
+          <w:trHeight w:val="600" w:hRule="atLeast"/>
         </w:trPr>
         <w:tc>
           <w:tcPr>
@@ -1249,6 +1276,15 @@
               <w:spacing w:after="0" w:before="0" w:line="276"/>
               <w:jc w:val="right"/>
             </w:pPr>
+            <w:r>
+              <w:rPr>
+                <w:rFonts w:ascii="맑은 고딕" w:cs="맑은 고딕" w:eastAsia="맑은 고딕" w:hAnsi="맑은 고딕"/>
+                <w:color w:val="1F4E9C"/>
+                <w:sz w:val="22"/>
+                <w:szCs w:val="22"/>
+              </w:rPr>
+              <w:t xml:space="preserve"/>
+            </w:r>
             <w:r>
               <w:rPr>
                 <w:rFonts w:ascii="맑은 고딕" w:cs="맑은 고딕" w:eastAsia="맑은 고딕" w:hAnsi="맑은 고딕"/>
@@ -1275,7 +1311,7 @@
           <w:sz w:val="22"/>
           <w:szCs w:val="22"/>
         </w:rPr>
-        <w:t xml:space="preserve">(회사명)　　　　　　　　　　　　　　귀중</w:t>
+        <w:t xml:space="preserve">(회사명)　　　　　　　　　　　　귀중</w:t>
       </w:r>
     </w:p>
     <w:sectPr>

</xml_diff>